<commit_message>
docs: add native clickable hyperlinks to submission docx
</commit_message>
<xml_diff>
--- a/Darukaa_Earth_Submission_Document.docx
+++ b/Darukaa_Earth_Submission_Document.docx
@@ -57,15 +57,16 @@
         </w:rPr>
         <w:t xml:space="preserve">GitHub Repository Link: </w:t>
       </w:r>
-      <w:r>
-        <w:rPr>
-          <w:rFonts w:ascii="Arial" w:hAnsi="Arial"/>
-          <w:i w:val="0"/>
-          <w:color w:val="334155"/>
-          <w:sz w:val="21"/>
-        </w:rPr>
-        <w:t>https://github.com/ahsan-zamil/darukaa-earth</w:t>
-      </w:r>
+      <w:hyperlink r:id="rId9">
+        <w:r>
+          <w:rPr>
+            <w:color w:val="0284C7"/>
+            <w:u w:val="single"/>
+            <w:b/>
+          </w:rPr>
+          <w:t>https://github.com/ahsan-zamil/darukaa-earth</w:t>
+        </w:r>
+      </w:hyperlink>
     </w:p>
     <w:p>
       <w:pPr>
@@ -80,15 +81,16 @@
         </w:rPr>
         <w:t xml:space="preserve">Live Demo URL: </w:t>
       </w:r>
-      <w:r>
-        <w:rPr>
-          <w:rFonts w:ascii="Arial" w:hAnsi="Arial"/>
-          <w:i w:val="0"/>
-          <w:color w:val="334155"/>
-          <w:sz w:val="21"/>
-        </w:rPr>
-        <w:t>https://fresh-adults-read.loca.lt</w:t>
-      </w:r>
+      <w:hyperlink r:id="rId10">
+        <w:r>
+          <w:rPr>
+            <w:color w:val="0284C7"/>
+            <w:u w:val="single"/>
+            <w:b/>
+          </w:rPr>
+          <w:t>https://fresh-adults-read.loca.lt</w:t>
+        </w:r>
+      </w:hyperlink>
     </w:p>
     <w:p>
       <w:pPr>
@@ -605,7 +607,7 @@
           <w:color w:val="334155"/>
           <w:sz w:val="21"/>
         </w:rPr>
-        <w:t>git clone https://github.com/your-username/darukaa-earth.git</w:t>
+        <w:t>git clone https://github.com/ahsan-zamil/darukaa-earth.git</w:t>
         <w:br/>
         <w:t>cd darukaa-earth</w:t>
         <w:br/>

</xml_diff>